<commit_message>
Make article 4 of the fund decree explicit in criteria documents
Co-Authored-By: Claude Opus 5.5 <noreply@anthropic.com>
Claude-Session: https://claude.ai/code/session_01VHwNN6RfVzTYVCS9bRLUAz
</commit_message>
<xml_diff>
--- a/entregables/Resumen_criterios_FEAC_BCS.docx
+++ b/entregables/Resumen_criterios_FEAC_BCS.docx
@@ -99,7 +99,7 @@
           <w:sz w:val="21"/>
           <w:szCs w:val="21"/>
         </w:rPr>
-        <w:t xml:space="preserve">los 16 fines del artículo 4 del Decreto del Fondo, agrupados en 6 líneas temáticas.</w:t>
+        <w:t xml:space="preserve">los 16 fines del Fondo que establece el artículo 4 del Decreto, agrupados en 6 líneas temáticas (ver sección 2).</w:t>
       </w:r>
     </w:p>
     <w:p>
@@ -223,7 +223,20 @@
         <w:rPr>
           <w:rFonts w:ascii="Arial" w:cs="Arial" w:eastAsia="Arial" w:hAnsi="Arial"/>
         </w:rPr>
-        <w:t xml:space="preserve">2. Temas financiables y requisitos específicos</w:t>
+        <w:t xml:space="preserve">2. Temas financiables: los fines del Fondo (artículo 4 del Decreto)</w:t>
+      </w:r>
+    </w:p>
+    <w:p>
+      <w:pPr>
+        <w:spacing w:after="120"/>
+      </w:pPr>
+      <w:r>
+        <w:rPr>
+          <w:rFonts w:ascii="Arial" w:cs="Arial" w:eastAsia="Arial" w:hAnsi="Arial"/>
+          <w:sz w:val="21"/>
+          <w:szCs w:val="21"/>
+        </w:rPr>
+        <w:t xml:space="preserve">El artículo 4 del Decreto por el que se constituye el Fideicomiso Público denominado Fondo Estatal Ambiental y Climático de Baja California Sur establece los fines del Fondo: 16 fracciones (I a XVI) que definen en qué puede invertir sus recursos. En este documento y en la herramienta, «fines del Fondo», «temas» y «fracciones del art. 4 del Decreto» significan lo mismo.</w:t>
       </w:r>
     </w:p>
     <w:p>
@@ -252,10 +265,10 @@
         </w:tblBorders>
       </w:tblPr>
       <w:tblGrid>
-        <w:gridCol w:w="700"/>
-        <w:gridCol w:w="2200"/>
-        <w:gridCol w:w="3700"/>
-        <w:gridCol w:w="2760"/>
+        <w:gridCol w:w="1000"/>
+        <w:gridCol w:w="2100"/>
+        <w:gridCol w:w="3560"/>
+        <w:gridCol w:w="2700"/>
       </w:tblGrid>
       <w:tr>
         <w:trPr>
@@ -263,7 +276,7 @@
         </w:trPr>
         <w:tc>
           <w:tcPr>
-            <w:tcW w:type="dxa" w:w="700"/>
+            <w:tcW w:type="dxa" w:w="1000"/>
             <w:tcBorders>
               <w:top w:val="single" w:color="BFBFBF" w:sz="4"/>
               <w:left w:val="single" w:color="BFBFBF" w:sz="4"/>
@@ -288,13 +301,13 @@
                 <w:sz w:val="17"/>
                 <w:szCs w:val="17"/>
               </w:rPr>
-              <w:t xml:space="preserve">Fr.</w:t>
-            </w:r>
-          </w:p>
-        </w:tc>
-        <w:tc>
-          <w:tcPr>
-            <w:tcW w:type="dxa" w:w="2200"/>
+              <w:t xml:space="preserve">Fracción del art. 4</w:t>
+            </w:r>
+          </w:p>
+        </w:tc>
+        <w:tc>
+          <w:tcPr>
+            <w:tcW w:type="dxa" w:w="2100"/>
             <w:tcBorders>
               <w:top w:val="single" w:color="BFBFBF" w:sz="4"/>
               <w:left w:val="single" w:color="BFBFBF" w:sz="4"/>
@@ -325,7 +338,7 @@
         </w:tc>
         <w:tc>
           <w:tcPr>
-            <w:tcW w:type="dxa" w:w="3700"/>
+            <w:tcW w:type="dxa" w:w="3560"/>
             <w:tcBorders>
               <w:top w:val="single" w:color="BFBFBF" w:sz="4"/>
               <w:left w:val="single" w:color="BFBFBF" w:sz="4"/>
@@ -356,7 +369,7 @@
         </w:tc>
         <w:tc>
           <w:tcPr>
-            <w:tcW w:type="dxa" w:w="2760"/>
+            <w:tcW w:type="dxa" w:w="2700"/>
             <w:tcBorders>
               <w:top w:val="single" w:color="BFBFBF" w:sz="4"/>
               <w:left w:val="single" w:color="BFBFBF" w:sz="4"/>
@@ -392,7 +405,7 @@
         </w:trPr>
         <w:tc>
           <w:tcPr>
-            <w:tcW w:type="dxa" w:w="700"/>
+            <w:tcW w:type="dxa" w:w="1000"/>
             <w:tcBorders>
               <w:top w:val="single" w:color="BFBFBF" w:sz="4"/>
               <w:left w:val="single" w:color="BFBFBF" w:sz="4"/>
@@ -422,7 +435,7 @@
         </w:tc>
         <w:tc>
           <w:tcPr>
-            <w:tcW w:type="dxa" w:w="2200"/>
+            <w:tcW w:type="dxa" w:w="2100"/>
             <w:tcBorders>
               <w:top w:val="single" w:color="BFBFBF" w:sz="4"/>
               <w:left w:val="single" w:color="BFBFBF" w:sz="4"/>
@@ -451,7 +464,7 @@
         </w:tc>
         <w:tc>
           <w:tcPr>
-            <w:tcW w:type="dxa" w:w="3700"/>
+            <w:tcW w:type="dxa" w:w="3560"/>
             <w:tcBorders>
               <w:top w:val="single" w:color="BFBFBF" w:sz="4"/>
               <w:left w:val="single" w:color="BFBFBF" w:sz="4"/>
@@ -480,7 +493,7 @@
         </w:tc>
         <w:tc>
           <w:tcPr>
-            <w:tcW w:type="dxa" w:w="2760"/>
+            <w:tcW w:type="dxa" w:w="2700"/>
             <w:tcBorders>
               <w:top w:val="single" w:color="BFBFBF" w:sz="4"/>
               <w:left w:val="single" w:color="BFBFBF" w:sz="4"/>
@@ -514,7 +527,7 @@
         </w:trPr>
         <w:tc>
           <w:tcPr>
-            <w:tcW w:type="dxa" w:w="700"/>
+            <w:tcW w:type="dxa" w:w="1000"/>
             <w:tcBorders>
               <w:top w:val="single" w:color="BFBFBF" w:sz="4"/>
               <w:left w:val="single" w:color="BFBFBF" w:sz="4"/>
@@ -544,7 +557,7 @@
         </w:tc>
         <w:tc>
           <w:tcPr>
-            <w:tcW w:type="dxa" w:w="2200"/>
+            <w:tcW w:type="dxa" w:w="2100"/>
             <w:tcBorders>
               <w:top w:val="single" w:color="BFBFBF" w:sz="4"/>
               <w:left w:val="single" w:color="BFBFBF" w:sz="4"/>
@@ -574,7 +587,7 @@
         </w:tc>
         <w:tc>
           <w:tcPr>
-            <w:tcW w:type="dxa" w:w="3700"/>
+            <w:tcW w:type="dxa" w:w="3560"/>
             <w:tcBorders>
               <w:top w:val="single" w:color="BFBFBF" w:sz="4"/>
               <w:left w:val="single" w:color="BFBFBF" w:sz="4"/>
@@ -604,7 +617,7 @@
         </w:tc>
         <w:tc>
           <w:tcPr>
-            <w:tcW w:type="dxa" w:w="2760"/>
+            <w:tcW w:type="dxa" w:w="2700"/>
             <w:tcBorders>
               <w:top w:val="single" w:color="BFBFBF" w:sz="4"/>
               <w:left w:val="single" w:color="BFBFBF" w:sz="4"/>
@@ -639,7 +652,7 @@
         </w:trPr>
         <w:tc>
           <w:tcPr>
-            <w:tcW w:type="dxa" w:w="700"/>
+            <w:tcW w:type="dxa" w:w="1000"/>
             <w:tcBorders>
               <w:top w:val="single" w:color="BFBFBF" w:sz="4"/>
               <w:left w:val="single" w:color="BFBFBF" w:sz="4"/>
@@ -669,7 +682,7 @@
         </w:tc>
         <w:tc>
           <w:tcPr>
-            <w:tcW w:type="dxa" w:w="2200"/>
+            <w:tcW w:type="dxa" w:w="2100"/>
             <w:tcBorders>
               <w:top w:val="single" w:color="BFBFBF" w:sz="4"/>
               <w:left w:val="single" w:color="BFBFBF" w:sz="4"/>
@@ -698,7 +711,7 @@
         </w:tc>
         <w:tc>
           <w:tcPr>
-            <w:tcW w:type="dxa" w:w="3700"/>
+            <w:tcW w:type="dxa" w:w="3560"/>
             <w:tcBorders>
               <w:top w:val="single" w:color="BFBFBF" w:sz="4"/>
               <w:left w:val="single" w:color="BFBFBF" w:sz="4"/>
@@ -727,7 +740,7 @@
         </w:tc>
         <w:tc>
           <w:tcPr>
-            <w:tcW w:type="dxa" w:w="2760"/>
+            <w:tcW w:type="dxa" w:w="2700"/>
             <w:tcBorders>
               <w:top w:val="single" w:color="BFBFBF" w:sz="4"/>
               <w:left w:val="single" w:color="BFBFBF" w:sz="4"/>
@@ -761,7 +774,7 @@
         </w:trPr>
         <w:tc>
           <w:tcPr>
-            <w:tcW w:type="dxa" w:w="700"/>
+            <w:tcW w:type="dxa" w:w="1000"/>
             <w:tcBorders>
               <w:top w:val="single" w:color="BFBFBF" w:sz="4"/>
               <w:left w:val="single" w:color="BFBFBF" w:sz="4"/>
@@ -791,7 +804,7 @@
         </w:tc>
         <w:tc>
           <w:tcPr>
-            <w:tcW w:type="dxa" w:w="2200"/>
+            <w:tcW w:type="dxa" w:w="2100"/>
             <w:tcBorders>
               <w:top w:val="single" w:color="BFBFBF" w:sz="4"/>
               <w:left w:val="single" w:color="BFBFBF" w:sz="4"/>
@@ -821,7 +834,7 @@
         </w:tc>
         <w:tc>
           <w:tcPr>
-            <w:tcW w:type="dxa" w:w="3700"/>
+            <w:tcW w:type="dxa" w:w="3560"/>
             <w:tcBorders>
               <w:top w:val="single" w:color="BFBFBF" w:sz="4"/>
               <w:left w:val="single" w:color="BFBFBF" w:sz="4"/>
@@ -851,7 +864,7 @@
         </w:tc>
         <w:tc>
           <w:tcPr>
-            <w:tcW w:type="dxa" w:w="2760"/>
+            <w:tcW w:type="dxa" w:w="2700"/>
             <w:tcBorders>
               <w:top w:val="single" w:color="BFBFBF" w:sz="4"/>
               <w:left w:val="single" w:color="BFBFBF" w:sz="4"/>
@@ -886,7 +899,7 @@
         </w:trPr>
         <w:tc>
           <w:tcPr>
-            <w:tcW w:type="dxa" w:w="700"/>
+            <w:tcW w:type="dxa" w:w="1000"/>
             <w:tcBorders>
               <w:top w:val="single" w:color="BFBFBF" w:sz="4"/>
               <w:left w:val="single" w:color="BFBFBF" w:sz="4"/>
@@ -916,7 +929,7 @@
         </w:tc>
         <w:tc>
           <w:tcPr>
-            <w:tcW w:type="dxa" w:w="2200"/>
+            <w:tcW w:type="dxa" w:w="2100"/>
             <w:tcBorders>
               <w:top w:val="single" w:color="BFBFBF" w:sz="4"/>
               <w:left w:val="single" w:color="BFBFBF" w:sz="4"/>
@@ -945,7 +958,7 @@
         </w:tc>
         <w:tc>
           <w:tcPr>
-            <w:tcW w:type="dxa" w:w="3700"/>
+            <w:tcW w:type="dxa" w:w="3560"/>
             <w:tcBorders>
               <w:top w:val="single" w:color="BFBFBF" w:sz="4"/>
               <w:left w:val="single" w:color="BFBFBF" w:sz="4"/>
@@ -974,7 +987,7 @@
         </w:tc>
         <w:tc>
           <w:tcPr>
-            <w:tcW w:type="dxa" w:w="2760"/>
+            <w:tcW w:type="dxa" w:w="2700"/>
             <w:tcBorders>
               <w:top w:val="single" w:color="BFBFBF" w:sz="4"/>
               <w:left w:val="single" w:color="BFBFBF" w:sz="4"/>
@@ -1008,7 +1021,7 @@
         </w:trPr>
         <w:tc>
           <w:tcPr>
-            <w:tcW w:type="dxa" w:w="700"/>
+            <w:tcW w:type="dxa" w:w="1000"/>
             <w:tcBorders>
               <w:top w:val="single" w:color="BFBFBF" w:sz="4"/>
               <w:left w:val="single" w:color="BFBFBF" w:sz="4"/>
@@ -1038,7 +1051,7 @@
         </w:tc>
         <w:tc>
           <w:tcPr>
-            <w:tcW w:type="dxa" w:w="2200"/>
+            <w:tcW w:type="dxa" w:w="2100"/>
             <w:tcBorders>
               <w:top w:val="single" w:color="BFBFBF" w:sz="4"/>
               <w:left w:val="single" w:color="BFBFBF" w:sz="4"/>
@@ -1068,7 +1081,7 @@
         </w:tc>
         <w:tc>
           <w:tcPr>
-            <w:tcW w:type="dxa" w:w="3700"/>
+            <w:tcW w:type="dxa" w:w="3560"/>
             <w:tcBorders>
               <w:top w:val="single" w:color="BFBFBF" w:sz="4"/>
               <w:left w:val="single" w:color="BFBFBF" w:sz="4"/>
@@ -1098,7 +1111,7 @@
         </w:tc>
         <w:tc>
           <w:tcPr>
-            <w:tcW w:type="dxa" w:w="2760"/>
+            <w:tcW w:type="dxa" w:w="2700"/>
             <w:tcBorders>
               <w:top w:val="single" w:color="BFBFBF" w:sz="4"/>
               <w:left w:val="single" w:color="BFBFBF" w:sz="4"/>
@@ -1133,7 +1146,7 @@
         </w:trPr>
         <w:tc>
           <w:tcPr>
-            <w:tcW w:type="dxa" w:w="700"/>
+            <w:tcW w:type="dxa" w:w="1000"/>
             <w:tcBorders>
               <w:top w:val="single" w:color="BFBFBF" w:sz="4"/>
               <w:left w:val="single" w:color="BFBFBF" w:sz="4"/>
@@ -1163,7 +1176,7 @@
         </w:tc>
         <w:tc>
           <w:tcPr>
-            <w:tcW w:type="dxa" w:w="2200"/>
+            <w:tcW w:type="dxa" w:w="2100"/>
             <w:tcBorders>
               <w:top w:val="single" w:color="BFBFBF" w:sz="4"/>
               <w:left w:val="single" w:color="BFBFBF" w:sz="4"/>
@@ -1192,7 +1205,7 @@
         </w:tc>
         <w:tc>
           <w:tcPr>
-            <w:tcW w:type="dxa" w:w="3700"/>
+            <w:tcW w:type="dxa" w:w="3560"/>
             <w:tcBorders>
               <w:top w:val="single" w:color="BFBFBF" w:sz="4"/>
               <w:left w:val="single" w:color="BFBFBF" w:sz="4"/>
@@ -1221,7 +1234,7 @@
         </w:tc>
         <w:tc>
           <w:tcPr>
-            <w:tcW w:type="dxa" w:w="2760"/>
+            <w:tcW w:type="dxa" w:w="2700"/>
             <w:tcBorders>
               <w:top w:val="single" w:color="BFBFBF" w:sz="4"/>
               <w:left w:val="single" w:color="BFBFBF" w:sz="4"/>
@@ -1255,7 +1268,7 @@
         </w:trPr>
         <w:tc>
           <w:tcPr>
-            <w:tcW w:type="dxa" w:w="700"/>
+            <w:tcW w:type="dxa" w:w="1000"/>
             <w:tcBorders>
               <w:top w:val="single" w:color="BFBFBF" w:sz="4"/>
               <w:left w:val="single" w:color="BFBFBF" w:sz="4"/>
@@ -1285,7 +1298,7 @@
         </w:tc>
         <w:tc>
           <w:tcPr>
-            <w:tcW w:type="dxa" w:w="2200"/>
+            <w:tcW w:type="dxa" w:w="2100"/>
             <w:tcBorders>
               <w:top w:val="single" w:color="BFBFBF" w:sz="4"/>
               <w:left w:val="single" w:color="BFBFBF" w:sz="4"/>
@@ -1315,7 +1328,7 @@
         </w:tc>
         <w:tc>
           <w:tcPr>
-            <w:tcW w:type="dxa" w:w="3700"/>
+            <w:tcW w:type="dxa" w:w="3560"/>
             <w:tcBorders>
               <w:top w:val="single" w:color="BFBFBF" w:sz="4"/>
               <w:left w:val="single" w:color="BFBFBF" w:sz="4"/>
@@ -1345,7 +1358,7 @@
         </w:tc>
         <w:tc>
           <w:tcPr>
-            <w:tcW w:type="dxa" w:w="2760"/>
+            <w:tcW w:type="dxa" w:w="2700"/>
             <w:tcBorders>
               <w:top w:val="single" w:color="BFBFBF" w:sz="4"/>
               <w:left w:val="single" w:color="BFBFBF" w:sz="4"/>
@@ -1380,7 +1393,7 @@
         </w:trPr>
         <w:tc>
           <w:tcPr>
-            <w:tcW w:type="dxa" w:w="700"/>
+            <w:tcW w:type="dxa" w:w="1000"/>
             <w:tcBorders>
               <w:top w:val="single" w:color="BFBFBF" w:sz="4"/>
               <w:left w:val="single" w:color="BFBFBF" w:sz="4"/>
@@ -1410,7 +1423,7 @@
         </w:tc>
         <w:tc>
           <w:tcPr>
-            <w:tcW w:type="dxa" w:w="2200"/>
+            <w:tcW w:type="dxa" w:w="2100"/>
             <w:tcBorders>
               <w:top w:val="single" w:color="BFBFBF" w:sz="4"/>
               <w:left w:val="single" w:color="BFBFBF" w:sz="4"/>
@@ -1439,7 +1452,7 @@
         </w:tc>
         <w:tc>
           <w:tcPr>
-            <w:tcW w:type="dxa" w:w="3700"/>
+            <w:tcW w:type="dxa" w:w="3560"/>
             <w:tcBorders>
               <w:top w:val="single" w:color="BFBFBF" w:sz="4"/>
               <w:left w:val="single" w:color="BFBFBF" w:sz="4"/>
@@ -1468,7 +1481,7 @@
         </w:tc>
         <w:tc>
           <w:tcPr>
-            <w:tcW w:type="dxa" w:w="2760"/>
+            <w:tcW w:type="dxa" w:w="2700"/>
             <w:tcBorders>
               <w:top w:val="single" w:color="BFBFBF" w:sz="4"/>
               <w:left w:val="single" w:color="BFBFBF" w:sz="4"/>
@@ -1502,7 +1515,7 @@
         </w:trPr>
         <w:tc>
           <w:tcPr>
-            <w:tcW w:type="dxa" w:w="700"/>
+            <w:tcW w:type="dxa" w:w="1000"/>
             <w:tcBorders>
               <w:top w:val="single" w:color="BFBFBF" w:sz="4"/>
               <w:left w:val="single" w:color="BFBFBF" w:sz="4"/>
@@ -1532,7 +1545,7 @@
         </w:tc>
         <w:tc>
           <w:tcPr>
-            <w:tcW w:type="dxa" w:w="2200"/>
+            <w:tcW w:type="dxa" w:w="2100"/>
             <w:tcBorders>
               <w:top w:val="single" w:color="BFBFBF" w:sz="4"/>
               <w:left w:val="single" w:color="BFBFBF" w:sz="4"/>
@@ -1562,7 +1575,7 @@
         </w:tc>
         <w:tc>
           <w:tcPr>
-            <w:tcW w:type="dxa" w:w="3700"/>
+            <w:tcW w:type="dxa" w:w="3560"/>
             <w:tcBorders>
               <w:top w:val="single" w:color="BFBFBF" w:sz="4"/>
               <w:left w:val="single" w:color="BFBFBF" w:sz="4"/>
@@ -1592,7 +1605,7 @@
         </w:tc>
         <w:tc>
           <w:tcPr>
-            <w:tcW w:type="dxa" w:w="2760"/>
+            <w:tcW w:type="dxa" w:w="2700"/>
             <w:tcBorders>
               <w:top w:val="single" w:color="BFBFBF" w:sz="4"/>
               <w:left w:val="single" w:color="BFBFBF" w:sz="4"/>
@@ -1627,7 +1640,7 @@
         </w:trPr>
         <w:tc>
           <w:tcPr>
-            <w:tcW w:type="dxa" w:w="700"/>
+            <w:tcW w:type="dxa" w:w="1000"/>
             <w:tcBorders>
               <w:top w:val="single" w:color="BFBFBF" w:sz="4"/>
               <w:left w:val="single" w:color="BFBFBF" w:sz="4"/>
@@ -1657,7 +1670,7 @@
         </w:tc>
         <w:tc>
           <w:tcPr>
-            <w:tcW w:type="dxa" w:w="2200"/>
+            <w:tcW w:type="dxa" w:w="2100"/>
             <w:tcBorders>
               <w:top w:val="single" w:color="BFBFBF" w:sz="4"/>
               <w:left w:val="single" w:color="BFBFBF" w:sz="4"/>
@@ -1686,7 +1699,7 @@
         </w:tc>
         <w:tc>
           <w:tcPr>
-            <w:tcW w:type="dxa" w:w="3700"/>
+            <w:tcW w:type="dxa" w:w="3560"/>
             <w:tcBorders>
               <w:top w:val="single" w:color="BFBFBF" w:sz="4"/>
               <w:left w:val="single" w:color="BFBFBF" w:sz="4"/>
@@ -1715,7 +1728,7 @@
         </w:tc>
         <w:tc>
           <w:tcPr>
-            <w:tcW w:type="dxa" w:w="2760"/>
+            <w:tcW w:type="dxa" w:w="2700"/>
             <w:tcBorders>
               <w:top w:val="single" w:color="BFBFBF" w:sz="4"/>
               <w:left w:val="single" w:color="BFBFBF" w:sz="4"/>
@@ -1749,7 +1762,7 @@
         </w:trPr>
         <w:tc>
           <w:tcPr>
-            <w:tcW w:type="dxa" w:w="700"/>
+            <w:tcW w:type="dxa" w:w="1000"/>
             <w:tcBorders>
               <w:top w:val="single" w:color="BFBFBF" w:sz="4"/>
               <w:left w:val="single" w:color="BFBFBF" w:sz="4"/>
@@ -1779,7 +1792,7 @@
         </w:tc>
         <w:tc>
           <w:tcPr>
-            <w:tcW w:type="dxa" w:w="2200"/>
+            <w:tcW w:type="dxa" w:w="2100"/>
             <w:tcBorders>
               <w:top w:val="single" w:color="BFBFBF" w:sz="4"/>
               <w:left w:val="single" w:color="BFBFBF" w:sz="4"/>
@@ -1809,7 +1822,7 @@
         </w:tc>
         <w:tc>
           <w:tcPr>
-            <w:tcW w:type="dxa" w:w="3700"/>
+            <w:tcW w:type="dxa" w:w="3560"/>
             <w:tcBorders>
               <w:top w:val="single" w:color="BFBFBF" w:sz="4"/>
               <w:left w:val="single" w:color="BFBFBF" w:sz="4"/>
@@ -1839,7 +1852,7 @@
         </w:tc>
         <w:tc>
           <w:tcPr>
-            <w:tcW w:type="dxa" w:w="2760"/>
+            <w:tcW w:type="dxa" w:w="2700"/>
             <w:tcBorders>
               <w:top w:val="single" w:color="BFBFBF" w:sz="4"/>
               <w:left w:val="single" w:color="BFBFBF" w:sz="4"/>
@@ -1874,7 +1887,7 @@
         </w:trPr>
         <w:tc>
           <w:tcPr>
-            <w:tcW w:type="dxa" w:w="700"/>
+            <w:tcW w:type="dxa" w:w="1000"/>
             <w:tcBorders>
               <w:top w:val="single" w:color="BFBFBF" w:sz="4"/>
               <w:left w:val="single" w:color="BFBFBF" w:sz="4"/>
@@ -1904,7 +1917,7 @@
         </w:tc>
         <w:tc>
           <w:tcPr>
-            <w:tcW w:type="dxa" w:w="2200"/>
+            <w:tcW w:type="dxa" w:w="2100"/>
             <w:tcBorders>
               <w:top w:val="single" w:color="BFBFBF" w:sz="4"/>
               <w:left w:val="single" w:color="BFBFBF" w:sz="4"/>
@@ -1933,7 +1946,7 @@
         </w:tc>
         <w:tc>
           <w:tcPr>
-            <w:tcW w:type="dxa" w:w="3700"/>
+            <w:tcW w:type="dxa" w:w="3560"/>
             <w:tcBorders>
               <w:top w:val="single" w:color="BFBFBF" w:sz="4"/>
               <w:left w:val="single" w:color="BFBFBF" w:sz="4"/>
@@ -1962,7 +1975,7 @@
         </w:tc>
         <w:tc>
           <w:tcPr>
-            <w:tcW w:type="dxa" w:w="2760"/>
+            <w:tcW w:type="dxa" w:w="2700"/>
             <w:tcBorders>
               <w:top w:val="single" w:color="BFBFBF" w:sz="4"/>
               <w:left w:val="single" w:color="BFBFBF" w:sz="4"/>
@@ -1996,7 +2009,7 @@
         </w:trPr>
         <w:tc>
           <w:tcPr>
-            <w:tcW w:type="dxa" w:w="700"/>
+            <w:tcW w:type="dxa" w:w="1000"/>
             <w:tcBorders>
               <w:top w:val="single" w:color="BFBFBF" w:sz="4"/>
               <w:left w:val="single" w:color="BFBFBF" w:sz="4"/>
@@ -2026,7 +2039,7 @@
         </w:tc>
         <w:tc>
           <w:tcPr>
-            <w:tcW w:type="dxa" w:w="2200"/>
+            <w:tcW w:type="dxa" w:w="2100"/>
             <w:tcBorders>
               <w:top w:val="single" w:color="BFBFBF" w:sz="4"/>
               <w:left w:val="single" w:color="BFBFBF" w:sz="4"/>
@@ -2056,7 +2069,7 @@
         </w:tc>
         <w:tc>
           <w:tcPr>
-            <w:tcW w:type="dxa" w:w="3700"/>
+            <w:tcW w:type="dxa" w:w="3560"/>
             <w:tcBorders>
               <w:top w:val="single" w:color="BFBFBF" w:sz="4"/>
               <w:left w:val="single" w:color="BFBFBF" w:sz="4"/>
@@ -2086,7 +2099,7 @@
         </w:tc>
         <w:tc>
           <w:tcPr>
-            <w:tcW w:type="dxa" w:w="2760"/>
+            <w:tcW w:type="dxa" w:w="2700"/>
             <w:tcBorders>
               <w:top w:val="single" w:color="BFBFBF" w:sz="4"/>
               <w:left w:val="single" w:color="BFBFBF" w:sz="4"/>
@@ -2121,7 +2134,7 @@
         </w:trPr>
         <w:tc>
           <w:tcPr>
-            <w:tcW w:type="dxa" w:w="700"/>
+            <w:tcW w:type="dxa" w:w="1000"/>
             <w:tcBorders>
               <w:top w:val="single" w:color="BFBFBF" w:sz="4"/>
               <w:left w:val="single" w:color="BFBFBF" w:sz="4"/>
@@ -2151,7 +2164,7 @@
         </w:tc>
         <w:tc>
           <w:tcPr>
-            <w:tcW w:type="dxa" w:w="2200"/>
+            <w:tcW w:type="dxa" w:w="2100"/>
             <w:tcBorders>
               <w:top w:val="single" w:color="BFBFBF" w:sz="4"/>
               <w:left w:val="single" w:color="BFBFBF" w:sz="4"/>
@@ -2180,7 +2193,7 @@
         </w:tc>
         <w:tc>
           <w:tcPr>
-            <w:tcW w:type="dxa" w:w="3700"/>
+            <w:tcW w:type="dxa" w:w="3560"/>
             <w:tcBorders>
               <w:top w:val="single" w:color="BFBFBF" w:sz="4"/>
               <w:left w:val="single" w:color="BFBFBF" w:sz="4"/>
@@ -2209,7 +2222,7 @@
         </w:tc>
         <w:tc>
           <w:tcPr>
-            <w:tcW w:type="dxa" w:w="2760"/>
+            <w:tcW w:type="dxa" w:w="2700"/>
             <w:tcBorders>
               <w:top w:val="single" w:color="BFBFBF" w:sz="4"/>
               <w:left w:val="single" w:color="BFBFBF" w:sz="4"/>
@@ -2243,7 +2256,7 @@
         </w:trPr>
         <w:tc>
           <w:tcPr>
-            <w:tcW w:type="dxa" w:w="700"/>
+            <w:tcW w:type="dxa" w:w="1000"/>
             <w:tcBorders>
               <w:top w:val="single" w:color="BFBFBF" w:sz="4"/>
               <w:left w:val="single" w:color="BFBFBF" w:sz="4"/>
@@ -2273,7 +2286,7 @@
         </w:tc>
         <w:tc>
           <w:tcPr>
-            <w:tcW w:type="dxa" w:w="2200"/>
+            <w:tcW w:type="dxa" w:w="2100"/>
             <w:tcBorders>
               <w:top w:val="single" w:color="BFBFBF" w:sz="4"/>
               <w:left w:val="single" w:color="BFBFBF" w:sz="4"/>
@@ -2303,7 +2316,7 @@
         </w:tc>
         <w:tc>
           <w:tcPr>
-            <w:tcW w:type="dxa" w:w="3700"/>
+            <w:tcW w:type="dxa" w:w="3560"/>
             <w:tcBorders>
               <w:top w:val="single" w:color="BFBFBF" w:sz="4"/>
               <w:left w:val="single" w:color="BFBFBF" w:sz="4"/>
@@ -2333,7 +2346,7 @@
         </w:tc>
         <w:tc>
           <w:tcPr>
-            <w:tcW w:type="dxa" w:w="2760"/>
+            <w:tcW w:type="dxa" w:w="2700"/>
             <w:tcBorders>
               <w:top w:val="single" w:color="BFBFBF" w:sz="4"/>
               <w:left w:val="single" w:color="BFBFBF" w:sz="4"/>
@@ -2717,7 +2730,7 @@
                 <w:sz w:val="17"/>
                 <w:szCs w:val="17"/>
               </w:rPr>
-              <w:t xml:space="preserve">Vinculación directa con un fin del art. 4</w:t>
+              <w:t xml:space="preserve">Vinculación directa con un fin del Fondo (art. 4 del Decreto)</w:t>
             </w:r>
           </w:p>
         </w:tc>
@@ -3941,7 +3954,7 @@
                 <w:sz w:val="16"/>
                 <w:szCs w:val="16"/>
               </w:rPr>
-              <w:t xml:space="preserve">Contribución a varios fines del art. 4 (automático)</w:t>
+              <w:t xml:space="preserve">Contribución a varios fines del Fondo (art. 4 del Decreto) (automático)</w:t>
             </w:r>
           </w:p>
         </w:tc>

</xml_diff>